<commit_message>
updated template due to the zip code fix that we made
</commit_message>
<xml_diff>
--- a/docassemble/RFApackage/data/templates/RFApackage_next_steps.docx
+++ b/docassemble/RFApackage/data/templates/RFApackage_next_steps.docx
@@ -491,13 +491,7 @@
       </w:r>
       <w:r>
         <w:br/>
-        <w:t xml:space="preserve">{{ address_city }}, {{ address_state }} </w:t>
-      </w:r>
-      <w:r>
-        <w:t>0</w:t>
-      </w:r>
-      <w:r>
-        <w:t>{{ address_zip }}</w:t>
+        <w:t>{{ address_city }}, {{ address_state }} {{ address_zip }}</w:t>
       </w:r>
       <w:r>
         <w:br/>

</xml_diff>